<commit_message>
Update formal GM reports with Executive Summary Box and memorandum format addressed directly to General Manager. Added EMAIL_TO_GM.md.
</commit_message>
<xml_diff>
--- a/final/GM_Stand_Allocation_Audit_Report.docx
+++ b/final/GM_Stand_Allocation_Audit_Report.docx
@@ -2,42 +2,201 @@
 <file path=word/document.xml><?xml version="1.0" encoding="utf-8"?>
 <w:document xmlns:wpc="http://schemas.microsoft.com/office/word/2010/wordprocessingCanvas" xmlns:mo="http://schemas.microsoft.com/office/mac/office/2008/main" xmlns:mc="http://schemas.openxmlformats.org/markup-compatibility/2006" xmlns:mv="urn:schemas-microsoft-com:mac:vml" xmlns:o="urn:schemas-microsoft-com:office:office" xmlns:r="http://schemas.openxmlformats.org/officeDocument/2006/relationships" xmlns:m="http://schemas.openxmlformats.org/officeDocument/2006/math" xmlns:v="urn:schemas-microsoft-com:vml" xmlns:wp14="http://schemas.microsoft.com/office/word/2010/wordprocessingDrawing" xmlns:wp="http://schemas.openxmlformats.org/drawingml/2006/wordprocessingDrawing" xmlns:w10="urn:schemas-microsoft-com:office:word" xmlns:w="http://schemas.openxmlformats.org/wordprocessingml/2006/main" xmlns:w14="http://schemas.microsoft.com/office/word/2010/wordml" xmlns:wpg="http://schemas.microsoft.com/office/word/2010/wordprocessingGroup" xmlns:wpi="http://schemas.microsoft.com/office/word/2010/wordprocessingInk" xmlns:wne="http://schemas.microsoft.com/office/word/2006/wordml" xmlns:wps="http://schemas.microsoft.com/office/word/2010/wordprocessingShape" mc:Ignorable="w14 wp14">
   <w:body>
-    <w:p>
-      <w:r>
-        <w:rPr>
-          <w:rFonts w:ascii="Calibri" w:hAnsi="Calibri"/>
-          <w:b/>
-          <w:color w:val="1F497D"/>
-          <w:sz w:val="44"/>
-        </w:rPr>
-        <w:t>STAND ALLOCATION AUDIT &amp; RECONCILIATION REPORT</w:t>
-      </w:r>
-    </w:p>
-    <w:p>
-      <w:r>
-        <w:rPr>
-          <w:rFonts w:ascii="Calibri" w:hAnsi="Calibri"/>
-          <w:i/>
-          <w:color w:val="595959"/>
-          <w:sz w:val="26"/>
-        </w:rPr>
-        <w:t>Audit Analysis of 'Stands Allocation Listing GM-Final.xlsx' vs. Master Database</w:t>
-      </w:r>
-    </w:p>
-    <w:p>
-      <w:r>
-        <w:rPr>
-          <w:rFonts w:ascii="Calibri" w:hAnsi="Calibri"/>
-          <w:b/>
-          <w:color w:val="1F497D"/>
-          <w:sz w:val="20"/>
-        </w:rPr>
-        <w:t>Prepared for: General Manager | Date: July 28, 2026 | Status: Pending GM Alignment</w:t>
-      </w:r>
-    </w:p>
+    <w:tbl>
+      <w:tblPr>
+        <w:tblW w:type="auto" w:w="0"/>
+        <w:jc w:val="center"/>
+        <w:tblLook w:firstColumn="1" w:firstRow="1" w:lastColumn="0" w:lastRow="0" w:noHBand="0" w:noVBand="1" w:val="04A0"/>
+      </w:tblPr>
+      <w:tblGrid>
+        <w:gridCol w:w="4680"/>
+        <w:gridCol w:w="4680"/>
+      </w:tblGrid>
+      <w:tr>
+        <w:tc>
+          <w:tcPr>
+            <w:tcW w:type="dxa" w:w="4680"/>
+          </w:tcPr>
+          <w:p>
+            <w:r>
+              <w:rPr>
+                <w:rFonts w:ascii="Calibri" w:hAnsi="Calibri"/>
+                <w:b/>
+                <w:color w:val="1F497D"/>
+              </w:rPr>
+              <w:t>TO:</w:t>
+            </w:r>
+          </w:p>
+        </w:tc>
+        <w:tc>
+          <w:tcPr>
+            <w:tcW w:type="dxa" w:w="4680"/>
+          </w:tcPr>
+          <w:p>
+            <w:r>
+              <w:rPr>
+                <w:rFonts w:ascii="Calibri" w:hAnsi="Calibri"/>
+                <w:b w:val="0"/>
+              </w:rPr>
+              <w:t>General Manager</w:t>
+            </w:r>
+          </w:p>
+        </w:tc>
+      </w:tr>
+      <w:tr>
+        <w:tc>
+          <w:tcPr>
+            <w:tcW w:type="dxa" w:w="4680"/>
+          </w:tcPr>
+          <w:p>
+            <w:r>
+              <w:rPr>
+                <w:rFonts w:ascii="Calibri" w:hAnsi="Calibri"/>
+                <w:b/>
+                <w:color w:val="1F497D"/>
+              </w:rPr>
+              <w:t>FROM:</w:t>
+            </w:r>
+          </w:p>
+        </w:tc>
+        <w:tc>
+          <w:tcPr>
+            <w:tcW w:type="dxa" w:w="4680"/>
+          </w:tcPr>
+          <w:p>
+            <w:r>
+              <w:rPr>
+                <w:rFonts w:ascii="Calibri" w:hAnsi="Calibri"/>
+                <w:b w:val="0"/>
+              </w:rPr>
+              <w:t>Data Audit &amp; Enumeration Team</w:t>
+            </w:r>
+          </w:p>
+        </w:tc>
+      </w:tr>
+      <w:tr>
+        <w:tc>
+          <w:tcPr>
+            <w:tcW w:type="dxa" w:w="4680"/>
+          </w:tcPr>
+          <w:p>
+            <w:r>
+              <w:rPr>
+                <w:rFonts w:ascii="Calibri" w:hAnsi="Calibri"/>
+                <w:b/>
+                <w:color w:val="1F497D"/>
+              </w:rPr>
+              <w:t>DATE:</w:t>
+            </w:r>
+          </w:p>
+        </w:tc>
+        <w:tc>
+          <w:tcPr>
+            <w:tcW w:type="dxa" w:w="4680"/>
+          </w:tcPr>
+          <w:p>
+            <w:r>
+              <w:rPr>
+                <w:rFonts w:ascii="Calibri" w:hAnsi="Calibri"/>
+                <w:b w:val="0"/>
+              </w:rPr>
+              <w:t>July 28, 2026</w:t>
+            </w:r>
+          </w:p>
+        </w:tc>
+      </w:tr>
+      <w:tr>
+        <w:tc>
+          <w:tcPr>
+            <w:tcW w:type="dxa" w:w="4680"/>
+          </w:tcPr>
+          <w:p>
+            <w:r>
+              <w:rPr>
+                <w:rFonts w:ascii="Calibri" w:hAnsi="Calibri"/>
+                <w:b/>
+                <w:color w:val="1F497D"/>
+              </w:rPr>
+              <w:t>SUBJECT:</w:t>
+            </w:r>
+          </w:p>
+        </w:tc>
+        <w:tc>
+          <w:tcPr>
+            <w:tcW w:type="dxa" w:w="4680"/>
+          </w:tcPr>
+          <w:p>
+            <w:r>
+              <w:rPr>
+                <w:rFonts w:ascii="Calibri" w:hAnsi="Calibri"/>
+                <w:b/>
+              </w:rPr>
+              <w:t>STAND ALLOCATION AUDIT &amp; RECONCILIATION REPORT (GM-FINAL LISTING VS. MASTER DATABASE)</w:t>
+            </w:r>
+          </w:p>
+        </w:tc>
+      </w:tr>
+    </w:tbl>
     <w:p>
       <w:pPr>
-        <w:spacing w:after="120"/>
+        <w:spacing w:after="160"/>
+      </w:pPr>
+    </w:p>
+    <w:tbl>
+      <w:tblPr>
+        <w:tblW w:type="auto" w:w="0"/>
+        <w:jc w:val="center"/>
+        <w:tblLook w:firstColumn="1" w:firstRow="1" w:lastColumn="0" w:lastRow="0" w:noHBand="0" w:noVBand="1" w:val="04A0"/>
+      </w:tblPr>
+      <w:tblGrid>
+        <w:gridCol w:w="9360"/>
+      </w:tblGrid>
+      <w:tr>
+        <w:tc>
+          <w:tcPr>
+            <w:tcW w:type="dxa" w:w="9360"/>
+            <w:shd w:fill="F2F5F8"/>
+          </w:tcPr>
+          <w:p>
+            <w:r>
+              <w:rPr>
+                <w:rFonts w:ascii="Calibri" w:hAnsi="Calibri"/>
+                <w:b/>
+                <w:color w:val="1F497D"/>
+                <w:sz w:val="26"/>
+              </w:rPr>
+              <w:t>📌 EXECUTIVE SUMMARY FOR THE GENERAL MANAGER</w:t>
+            </w:r>
+          </w:p>
+          <w:p>
+            <w:r>
+              <w:rPr>
+                <w:rFonts w:ascii="Calibri" w:hAnsi="Calibri"/>
+                <w:sz w:val="20"/>
+              </w:rPr>
+              <w:t>This report provides an executive audit briefing comparing your submitted file 'Stands Allocation Listing GM-Final.xlsx' against the consolidated Master Database (3,356 active records). Key metrics at a glance:</w:t>
+              <w:br/>
+              <w:br/>
+              <w:t>• Total Slots in GM File: 882 Stand Slots (209 Allocated Members, 673 Unallocated/Empty Slots)</w:t>
+              <w:br/>
+              <w:t>• Category 1 (Exact Matches): 78 Members (37.3%) — Fully verified and aligned with Master Database.</w:t>
+              <w:br/>
+              <w:t>• Category 2 (Stand Conflicts): 14 Members (6.7%) — Exist in Master, but assigned a different Stand No in your GM file.</w:t>
+              <w:br/>
+              <w:t>• Category 3 (Re-assignments): 88 Stands (42.1%) — Stand exists in Master, but assigned to a different member in your GM file.</w:t>
+              <w:br/>
+              <w:t>• Category 4 (New Members): 29 Members (13.9%) — Completely new members &amp; stands ready to be added to Master.</w:t>
+              <w:br/>
+              <w:br/>
+              <w:t>Action Requested: We seek your guidance on Category 2 (Stand Conflicts) and Category 3 (Re-assignments) before updating the Master Database.</w:t>
+            </w:r>
+          </w:p>
+        </w:tc>
+      </w:tr>
+    </w:tbl>
+    <w:p>
+      <w:pPr>
+        <w:spacing w:after="240"/>
       </w:pPr>
     </w:p>
     <w:p>
@@ -45,17 +204,23 @@
         <w:pStyle w:val="Heading1"/>
       </w:pPr>
       <w:r>
-        <w:t>1. Executive Summary</w:t>
+        <w:t>1. Background &amp; Purpose</w:t>
       </w:r>
     </w:p>
     <w:p>
       <w:r>
-        <w:t>Before merging the General Manager's final allocation listing ('Stands Allocation Listing GM-Final.xlsx') into the Master Database (3,356 active records), a comprehensive automated audit was conducted. The GM file contains 882 total stand allocation slots, of which 209 slots contain allocated member details and 673 remain unallocated/empty.</w:t>
+        <w:t>Dear General Manager,</w:t>
+        <w:br/>
+        <w:br/>
+        <w:t>Prior to committing any structural changes to the Master Database, our team conducted an automated reconciliation audit to compare your submitted allocation listing against the existing 3,356 active records in our database. This report outlines the verified records, identifies conflicting stand assignments, and highlights new allocations for your decision.</w:t>
       </w:r>
     </w:p>
     <w:p>
+      <w:pPr>
+        <w:pStyle w:val="Heading1"/>
+      </w:pPr>
       <w:r>
-        <w:t>Our cross-referencing analysis categorized the 209 allocated members into four distinct audit groups to highlight exact matches, conflicts requiring GM decision, and new additions:</w:t>
+        <w:t>2. Cross-Match Overview Table</w:t>
       </w:r>
     </w:p>
     <w:tbl>
@@ -131,7 +296,7 @@
                 <w:b/>
                 <w:color w:val="FFFFFF"/>
               </w:rPr>
-              <w:t>Status / Decision Required</w:t>
+              <w:t>Action / Decision Required from GM</w:t>
             </w:r>
           </w:p>
         </w:tc>
@@ -173,7 +338,7 @@
           </w:tcPr>
           <w:p>
             <w:r>
-              <w:t>Verified - No action needed (Ready to sync)</w:t>
+              <w:t>Verified — Ready to sync automatically</w:t>
             </w:r>
           </w:p>
         </w:tc>
@@ -219,7 +384,7 @@
           </w:tcPr>
           <w:p>
             <w:r>
-              <w:t>Decision: Overwrite Master stand with GM stand?</w:t>
+              <w:t>GM Decision: Confirm if GM stand replaces Master stand</w:t>
             </w:r>
           </w:p>
         </w:tc>
@@ -261,7 +426,7 @@
           </w:tcPr>
           <w:p>
             <w:r>
-              <w:t>Decision: Confirm GM member replaces Master member?</w:t>
+              <w:t>GM Decision: Confirm if GM member replaces Master member</w:t>
             </w:r>
           </w:p>
         </w:tc>
@@ -307,7 +472,49 @@
           </w:tcPr>
           <w:p>
             <w:r>
-              <w:t>Action: Add 29 new members to Master Database</w:t>
+              <w:t>Action Required: Add 29 new members to Master</w:t>
+            </w:r>
+          </w:p>
+        </w:tc>
+      </w:tr>
+      <w:tr>
+        <w:tc>
+          <w:tcPr>
+            <w:tcW w:type="dxa" w:w="2340"/>
+          </w:tcPr>
+          <w:p>
+            <w:r>
+              <w:t>TOTAL ALLOCATED IN GM FILE</w:t>
+            </w:r>
+          </w:p>
+        </w:tc>
+        <w:tc>
+          <w:tcPr>
+            <w:tcW w:type="dxa" w:w="2340"/>
+          </w:tcPr>
+          <w:p>
+            <w:r>
+              <w:t>209</w:t>
+            </w:r>
+          </w:p>
+        </w:tc>
+        <w:tc>
+          <w:tcPr>
+            <w:tcW w:type="dxa" w:w="2340"/>
+          </w:tcPr>
+          <w:p>
+            <w:r>
+              <w:t>100.0%</w:t>
+            </w:r>
+          </w:p>
+        </w:tc>
+        <w:tc>
+          <w:tcPr>
+            <w:tcW w:type="dxa" w:w="2340"/>
+          </w:tcPr>
+          <w:p>
+            <w:r>
+              <w:t>Total members listed in your GM-Final file</w:t>
             </w:r>
           </w:p>
         </w:tc>
@@ -323,7 +530,7 @@
         <w:pStyle w:val="Heading1"/>
       </w:pPr>
       <w:r>
-        <w:t>2. Detailed Findings &amp; Category Breakdown</w:t>
+        <w:t>3. Detailed Audit Findings for GM Guidance</w:t>
       </w:r>
     </w:p>
     <w:p>
@@ -331,25 +538,12 @@
         <w:pStyle w:val="Heading2"/>
       </w:pPr>
       <w:r>
-        <w:t>Category 1: Exact Matches (78 Members - 37.3%)</w:t>
+        <w:t>Category 2: Members with Stand Number Conflicts (14 Cases)</w:t>
       </w:r>
     </w:p>
     <w:p>
       <w:r>
-        <w:t>These 78 members match our Master Database perfectly by National ID / Name and Stand Number. No manual intervention is required for these entries.</w:t>
-      </w:r>
-    </w:p>
-    <w:p>
-      <w:pPr>
-        <w:pStyle w:val="Heading2"/>
-      </w:pPr>
-      <w:r>
-        <w:t>Category 2: Member Exists, Different Stand Number (14 Members - 6.7%)</w:t>
-      </w:r>
-    </w:p>
-    <w:p>
-      <w:r>
-        <w:t>These members exist in our Master Database (matched by National ID), but the GM listing assigns them to a different stand number. We require GM guidance on whether to update the Master Database with the new stand numbers listed below:</w:t>
+        <w:t>The 14 members below exist in our Master Database (matched by National ID), but your GM listing assigns them to a different stand number. Please review and confirm if your GM stand numbers should overwrite the master records:</w:t>
       </w:r>
     </w:p>
     <w:tbl>
@@ -1377,12 +1571,12 @@
         <w:pStyle w:val="Heading2"/>
       </w:pPr>
       <w:r>
-        <w:t>Category 3: Stand Exists, Different Member / Re-assignment (88 Stands - 42.1%)</w:t>
+        <w:t>Category 3: Re-assignment Conflicts (88 Stands)</w:t>
       </w:r>
     </w:p>
     <w:p>
       <w:r>
-        <w:t>These stand numbers exist in our Master Database but are currently occupied by different members or marked as 'No details'. Below is a sample of these 88 re-assignment cases requiring GM confirmation:</w:t>
+        <w:t>These 88 stand numbers exist in our Master Database but are currently recorded under a different member. Below is a sample of 10 cases (the full 88 list is in the attached Excel workbook):</w:t>
       </w:r>
     </w:p>
     <w:tbl>
@@ -1522,7 +1716,7 @@
           </w:tcPr>
           <w:p>
             <w:r>
-              <w:t>batch_tablet_300.csv / batch_tat_200.csv</w:t>
+              <w:t>batch_tat_200.csv / batch_tablet_300.csv</w:t>
             </w:r>
           </w:p>
         </w:tc>
@@ -1579,7 +1773,7 @@
           </w:tcPr>
           <w:p>
             <w:r>
-              <w:t>batch_tablet_300.csv / batch_tat_300.csv</w:t>
+              <w:t>batch_tat_300.csv / batch_tablet_300.csv</w:t>
             </w:r>
           </w:p>
         </w:tc>
@@ -1688,7 +1882,7 @@
           </w:tcPr>
           <w:p>
             <w:r>
-              <w:t>batch_tablet_300.csv / batch_200m2.csv / batch_tat_300.csv</w:t>
+              <w:t>batch_tat_300.csv / batch_200m2.csv / batch_tablet_300.csv</w:t>
             </w:r>
           </w:p>
         </w:tc>
@@ -1740,7 +1934,7 @@
           </w:tcPr>
           <w:p>
             <w:r>
-              <w:t>batch_tablet_300.csv / batch_tat_200.csv</w:t>
+              <w:t>batch_tat_200.csv / batch_tablet_300.csv</w:t>
             </w:r>
           </w:p>
         </w:tc>
@@ -1797,7 +1991,7 @@
           </w:tcPr>
           <w:p>
             <w:r>
-              <w:t>batch_tablet_300.csv / batch_tat_madzimai.csv</w:t>
+              <w:t>batch_tat_madzimai.csv / batch_tablet_300.csv</w:t>
             </w:r>
           </w:p>
         </w:tc>
@@ -1849,7 +2043,7 @@
           </w:tcPr>
           <w:p>
             <w:r>
-              <w:t>batch_tablet_300.csv / batch_200_first_batch.csv / batch_200m2.csv</w:t>
+              <w:t>batch_200m2.csv / batch_tablet_300.csv / batch_200_first_batch.csv</w:t>
             </w:r>
           </w:p>
         </w:tc>
@@ -1958,7 +2152,7 @@
           </w:tcPr>
           <w:p>
             <w:r>
-              <w:t>batch_200_first_batch.csv / batch_200m2.csv / batch_tat_200.csv</w:t>
+              <w:t>batch_200m2.csv / batch_tat_200.csv / batch_200_first_batch.csv</w:t>
             </w:r>
           </w:p>
         </w:tc>
@@ -2025,21 +2219,18 @@
       <w:pPr>
         <w:spacing w:after="240"/>
       </w:pPr>
-      <w:r>
-        <w:t>(Complete list of all 88 re-assignments is provided in the attached Excel analysis workbook)</w:t>
-      </w:r>
     </w:p>
     <w:p>
       <w:pPr>
         <w:pStyle w:val="Heading2"/>
       </w:pPr>
       <w:r>
-        <w:t>Category 4: Completely NEW Members &amp; Stands (29 Members - 13.9%)</w:t>
+        <w:t>Category 4: Completely NEW Members to Add (29 Cases)</w:t>
       </w:r>
     </w:p>
     <w:p>
       <w:r>
-        <w:t>These 29 members and their stand numbers are entirely new and do not exist in our Master Database. They will be appended directly into the Master Database:</w:t>
+        <w:t>These 29 members and stand numbers are entirely new and will be added directly into the Master Database:</w:t>
       </w:r>
     </w:p>
     <w:tbl>
@@ -3997,22 +4188,16 @@
         <w:pStyle w:val="Heading1"/>
       </w:pPr>
       <w:r>
-        <w:t>3. Recommended Actions &amp; Next Steps</w:t>
+        <w:t>4. Next Steps &amp; Guidance Requested</w:t>
       </w:r>
     </w:p>
     <w:p>
       <w:r>
-        <w:t>1. Add New Members: Immediately append the 29 new members (Category 4) into the Master Database.</w:t>
-      </w:r>
-    </w:p>
-    <w:p>
-      <w:r>
-        <w:t>2. Approve Stand Number Updates: Confirm whether the 14 stand number updates (Category 2) should overwrite the Master Database.</w:t>
-      </w:r>
-    </w:p>
-    <w:p>
-      <w:r>
-        <w:t>3. Confirm Re-allocations: Review the 88 re-assignment conflicts (Category 3) to verify if the GM-Final listing supersedes field enumeration records.</w:t>
+        <w:t>1. Approval to Sync New Members: We will append the 29 new members (Category 4) into the Master Database.</w:t>
+        <w:br/>
+        <w:t>2. Guidance on Stand Conflicts: Please confirm if your GM stand numbers should overwrite the master records for the 14 members in Category 2.</w:t>
+        <w:br/>
+        <w:t>3. Guidance on Re-assignments: Please confirm if the 88 stand allocations in Category 3 supersede existing master records.</w:t>
       </w:r>
     </w:p>
     <w:sectPr>

</xml_diff>